<commit_message>
inicio de cambios de sistema en L
</commit_message>
<xml_diff>
--- a/InstruccionesChatGpt_Word/InstruccionesChatGpt_Word_009.docx
+++ b/InstruccionesChatGpt_Word/InstruccionesChatGpt_Word_009.docx
@@ -819,13 +819,14 @@
         </w:rPr>
       </w:pPr>
     </w:p>
-    <w:bookmarkStart w:id="0" w:name="_Toc228478906" w:displacedByCustomXml="next"/>
+    <w:bookmarkStart w:id="0" w:name="_Toc228505768" w:displacedByCustomXml="next"/>
     <w:sdt>
       <w:sdtPr>
         <w:rPr>
           <w:b w:val="0"/>
           <w:bCs w:val="0"/>
           <w:caps w:val="0"/>
+          <w:color w:val="auto"/>
           <w:spacing w:val="0"/>
           <w:sz w:val="20"/>
           <w:szCs w:val="20"/>
@@ -839,7 +840,6 @@
       </w:sdtPr>
       <w:sdtEndPr>
         <w:rPr>
-          <w:color w:val="auto"/>
           <w:lang w:val="es-ES"/>
         </w:rPr>
       </w:sdtEndPr>
@@ -876,7 +876,7 @@
           <w:r>
             <w:fldChar w:fldCharType="separate"/>
           </w:r>
-          <w:hyperlink w:anchor="_Toc228478906" w:history="1">
+          <w:hyperlink w:anchor="_Toc228505768" w:history="1">
             <w:r>
               <w:rPr>
                 <w:rStyle w:val="Hipervnculo"/>
@@ -919,7 +919,7 @@
                 <w:noProof/>
                 <w:webHidden/>
               </w:rPr>
-              <w:instrText xml:space="preserve"> PAGEREF _Toc228478906 \h </w:instrText>
+              <w:instrText xml:space="preserve"> PAGEREF _Toc228505768 \h </w:instrText>
             </w:r>
             <w:r>
               <w:rPr>
@@ -964,7 +964,7 @@
               <w:lang w:eastAsia="es-CO"/>
             </w:rPr>
           </w:pPr>
-          <w:hyperlink w:anchor="_Toc228478907" w:history="1">
+          <w:hyperlink w:anchor="_Toc228505769" w:history="1">
             <w:r>
               <w:rPr>
                 <w:rStyle w:val="Hipervnculo"/>
@@ -1007,7 +1007,7 @@
                 <w:noProof/>
                 <w:webHidden/>
               </w:rPr>
-              <w:instrText xml:space="preserve"> PAGEREF _Toc228478907 \h </w:instrText>
+              <w:instrText xml:space="preserve"> PAGEREF _Toc228505769 \h </w:instrText>
             </w:r>
             <w:r>
               <w:rPr>
@@ -1052,7 +1052,7 @@
               <w:lang w:eastAsia="es-CO"/>
             </w:rPr>
           </w:pPr>
-          <w:hyperlink w:anchor="_Toc228478908" w:history="1">
+          <w:hyperlink w:anchor="_Toc228505770" w:history="1">
             <w:r>
               <w:rPr>
                 <w:rStyle w:val="Hipervnculo"/>
@@ -1095,7 +1095,7 @@
                 <w:noProof/>
                 <w:webHidden/>
               </w:rPr>
-              <w:instrText xml:space="preserve"> PAGEREF _Toc228478908 \h </w:instrText>
+              <w:instrText xml:space="preserve"> PAGEREF _Toc228505770 \h </w:instrText>
             </w:r>
             <w:r>
               <w:rPr>
@@ -1140,7 +1140,7 @@
               <w:lang w:eastAsia="es-CO"/>
             </w:rPr>
           </w:pPr>
-          <w:hyperlink w:anchor="_Toc228478909" w:history="1">
+          <w:hyperlink w:anchor="_Toc228505771" w:history="1">
             <w:r>
               <w:rPr>
                 <w:rStyle w:val="Hipervnculo"/>
@@ -1183,7 +1183,7 @@
                 <w:noProof/>
                 <w:webHidden/>
               </w:rPr>
-              <w:instrText xml:space="preserve"> PAGEREF _Toc228478909 \h </w:instrText>
+              <w:instrText xml:space="preserve"> PAGEREF _Toc228505771 \h </w:instrText>
             </w:r>
             <w:r>
               <w:rPr>
@@ -1228,7 +1228,7 @@
               <w:lang w:eastAsia="es-CO"/>
             </w:rPr>
           </w:pPr>
-          <w:hyperlink w:anchor="_Toc228478910" w:history="1">
+          <w:hyperlink w:anchor="_Toc228505772" w:history="1">
             <w:r>
               <w:rPr>
                 <w:rStyle w:val="Hipervnculo"/>
@@ -1250,7 +1250,7 @@
                 <w:rStyle w:val="Hipervnculo"/>
                 <w:noProof/>
               </w:rPr>
-              <w:t>2) ¿Cuáles referentes artísticos y técnicos tienen su herramienta?, utilice imágenes y descripciones escritas</w:t>
+              <w:t>¿Cuáles referentes artísticos y técnicos tienen su herramienta?, utilice imágenes y descripciones escritas</w:t>
             </w:r>
             <w:r>
               <w:rPr>
@@ -1271,7 +1271,7 @@
                 <w:noProof/>
                 <w:webHidden/>
               </w:rPr>
-              <w:instrText xml:space="preserve"> PAGEREF _Toc228478910 \h </w:instrText>
+              <w:instrText xml:space="preserve"> PAGEREF _Toc228505772 \h </w:instrText>
             </w:r>
             <w:r>
               <w:rPr>
@@ -1292,6 +1292,205 @@
                 <w:webHidden/>
               </w:rPr>
               <w:t>3</w:t>
+            </w:r>
+            <w:r>
+              <w:rPr>
+                <w:noProof/>
+                <w:webHidden/>
+              </w:rPr>
+              <w:fldChar w:fldCharType="end"/>
+            </w:r>
+          </w:hyperlink>
+        </w:p>
+        <w:p>
+          <w:pPr>
+            <w:pStyle w:val="TDC1"/>
+            <w:tabs>
+              <w:tab w:val="left" w:pos="440"/>
+              <w:tab w:val="right" w:leader="dot" w:pos="8494"/>
+            </w:tabs>
+            <w:rPr>
+              <w:noProof/>
+              <w:sz w:val="22"/>
+              <w:szCs w:val="22"/>
+              <w:lang w:eastAsia="es-CO"/>
+            </w:rPr>
+          </w:pPr>
+          <w:hyperlink w:anchor="_Toc228505773" w:history="1">
+            <w:r>
+              <w:rPr>
+                <w:rStyle w:val="Hipervnculo"/>
+                <w:noProof/>
+              </w:rPr>
+              <w:t>6.</w:t>
+            </w:r>
+            <w:r>
+              <w:rPr>
+                <w:noProof/>
+                <w:sz w:val="22"/>
+                <w:szCs w:val="22"/>
+                <w:lang w:eastAsia="es-CO"/>
+              </w:rPr>
+              <w:tab/>
+            </w:r>
+            <w:r>
+              <w:rPr>
+                <w:rStyle w:val="Hipervnculo"/>
+                <w:noProof/>
+              </w:rPr>
+              <w:t xml:space="preserve">Describa el algoritmo de </w:t>
+            </w:r>
+            <w:r>
+              <w:rPr>
+                <w:rStyle w:val="Hipervnculo"/>
+                <w:noProof/>
+                <w:shd w:val="clear" w:color="auto" w:fill="F0F8DE" w:themeFill="accent3" w:themeFillTint="33"/>
+              </w:rPr>
+              <w:t>Sistema en L</w:t>
+            </w:r>
+            <w:r>
+              <w:rPr>
+                <w:rStyle w:val="Hipervnculo"/>
+                <w:noProof/>
+              </w:rPr>
+              <w:t xml:space="preserve"> que va a utilizar, incluyendo los procesos de Modelado y Rigging procedural en maya.</w:t>
+            </w:r>
+            <w:r>
+              <w:rPr>
+                <w:noProof/>
+                <w:webHidden/>
+              </w:rPr>
+              <w:tab/>
+            </w:r>
+            <w:r>
+              <w:rPr>
+                <w:noProof/>
+                <w:webHidden/>
+              </w:rPr>
+              <w:fldChar w:fldCharType="begin"/>
+            </w:r>
+            <w:r>
+              <w:rPr>
+                <w:noProof/>
+                <w:webHidden/>
+              </w:rPr>
+              <w:instrText xml:space="preserve"> PAGEREF _Toc228505773 \h </w:instrText>
+            </w:r>
+            <w:r>
+              <w:rPr>
+                <w:noProof/>
+                <w:webHidden/>
+              </w:rPr>
+            </w:r>
+            <w:r>
+              <w:rPr>
+                <w:noProof/>
+                <w:webHidden/>
+              </w:rPr>
+              <w:fldChar w:fldCharType="separate"/>
+            </w:r>
+            <w:r>
+              <w:rPr>
+                <w:noProof/>
+                <w:webHidden/>
+              </w:rPr>
+              <w:t>5</w:t>
+            </w:r>
+            <w:r>
+              <w:rPr>
+                <w:noProof/>
+                <w:webHidden/>
+              </w:rPr>
+              <w:fldChar w:fldCharType="end"/>
+            </w:r>
+          </w:hyperlink>
+        </w:p>
+        <w:p>
+          <w:pPr>
+            <w:pStyle w:val="TDC2"/>
+            <w:tabs>
+              <w:tab w:val="left" w:pos="880"/>
+              <w:tab w:val="right" w:leader="dot" w:pos="8494"/>
+            </w:tabs>
+            <w:rPr>
+              <w:noProof/>
+              <w:sz w:val="22"/>
+              <w:szCs w:val="22"/>
+              <w:lang w:eastAsia="es-CO"/>
+            </w:rPr>
+          </w:pPr>
+          <w:hyperlink w:anchor="_Toc228505774" w:history="1">
+            <w:r>
+              <w:rPr>
+                <w:rStyle w:val="Hipervnculo"/>
+                <w:rFonts w:eastAsia="Times New Roman"/>
+                <w:b/>
+                <w:bCs/>
+                <w:noProof/>
+                <w:lang w:eastAsia="es-CO"/>
+              </w:rPr>
+              <w:t>6.1.</w:t>
+            </w:r>
+            <w:r>
+              <w:rPr>
+                <w:noProof/>
+                <w:sz w:val="22"/>
+                <w:szCs w:val="22"/>
+                <w:lang w:eastAsia="es-CO"/>
+              </w:rPr>
+              <w:tab/>
+            </w:r>
+            <w:r>
+              <w:rPr>
+                <w:rStyle w:val="Hipervnculo"/>
+                <w:rFonts w:eastAsia="Times New Roman"/>
+                <w:b/>
+                <w:bCs/>
+                <w:noProof/>
+                <w:lang w:eastAsia="es-CO"/>
+              </w:rPr>
+              <w:t>Vocabulario (Símbolos y elementos del sistema)</w:t>
+            </w:r>
+            <w:r>
+              <w:rPr>
+                <w:noProof/>
+                <w:webHidden/>
+              </w:rPr>
+              <w:tab/>
+            </w:r>
+            <w:r>
+              <w:rPr>
+                <w:noProof/>
+                <w:webHidden/>
+              </w:rPr>
+              <w:fldChar w:fldCharType="begin"/>
+            </w:r>
+            <w:r>
+              <w:rPr>
+                <w:noProof/>
+                <w:webHidden/>
+              </w:rPr>
+              <w:instrText xml:space="preserve"> PAGEREF _Toc228505774 \h </w:instrText>
+            </w:r>
+            <w:r>
+              <w:rPr>
+                <w:noProof/>
+                <w:webHidden/>
+              </w:rPr>
+            </w:r>
+            <w:r>
+              <w:rPr>
+                <w:noProof/>
+                <w:webHidden/>
+              </w:rPr>
+              <w:fldChar w:fldCharType="separate"/>
+            </w:r>
+            <w:r>
+              <w:rPr>
+                <w:noProof/>
+                <w:webHidden/>
+              </w:rPr>
+              <w:t>6</w:t>
             </w:r>
             <w:r>
               <w:rPr>
@@ -1702,7 +1901,7 @@
       <w:pPr>
         <w:pStyle w:val="Ttulo1"/>
       </w:pPr>
-      <w:bookmarkStart w:id="1" w:name="_Toc228478907"/>
+      <w:bookmarkStart w:id="1" w:name="_Toc228505769"/>
       <w:r>
         <w:t>Nombre de los artistas técnicos</w:t>
       </w:r>
@@ -1789,7 +1988,7 @@
       <w:pPr>
         <w:pStyle w:val="Ttulo1"/>
       </w:pPr>
-      <w:bookmarkStart w:id="2" w:name="_Toc228478908"/>
+      <w:bookmarkStart w:id="2" w:name="_Toc228505770"/>
       <w:r>
         <w:t>Nombre de la Herramienta:</w:t>
       </w:r>
@@ -1830,7 +2029,7 @@
       <w:pPr>
         <w:pStyle w:val="Ttulo1"/>
       </w:pPr>
-      <w:bookmarkStart w:id="3" w:name="_Toc228478909"/>
+      <w:bookmarkStart w:id="3" w:name="_Toc228505771"/>
       <w:r>
         <w:t>¿Cuál es el concepto artístico de su herramienta?</w:t>
       </w:r>
@@ -2497,6 +2696,7 @@
               <w:ind w:left="0"/>
             </w:pPr>
             <w:r>
+              <w:lastRenderedPageBreak/>
               <w:t>Tristeza</w:t>
             </w:r>
           </w:p>
@@ -2614,9 +2814,8 @@
       <w:pPr>
         <w:pStyle w:val="Ttulo1"/>
       </w:pPr>
-      <w:bookmarkStart w:id="4" w:name="_Toc228478910"/>
-      <w:r>
-        <w:lastRenderedPageBreak/>
+      <w:bookmarkStart w:id="4" w:name="_Toc228505772"/>
+      <w:r>
         <w:t xml:space="preserve">¿Cuáles referentes artísticos y técnicos tienen su herramienta?, </w:t>
       </w:r>
       <w:r>
@@ -3797,7 +3996,6 @@
                 <w:color w:val="000000"/>
                 <w:lang w:eastAsia="es-CO"/>
               </w:rPr>
-              <w:lastRenderedPageBreak/>
               <w:t>Referentes Técnicos</w:t>
             </w:r>
           </w:p>
@@ -4013,14 +4211,7 @@
                 <w:rStyle w:val="Textoennegrita"/>
                 <w:shd w:val="clear" w:color="auto" w:fill="F0F8DE" w:themeFill="accent3" w:themeFillTint="33"/>
               </w:rPr>
-              <w:t>quad</w:t>
-            </w:r>
-            <w:r>
-              <w:rPr>
-                <w:rStyle w:val="Textoennegrita"/>
-                <w:shd w:val="clear" w:color="auto" w:fill="F0F8DE" w:themeFill="accent3" w:themeFillTint="33"/>
-              </w:rPr>
-              <w:t>s</w:t>
+              <w:t>quads</w:t>
             </w:r>
             <w:proofErr w:type="spellEnd"/>
             <w:r>
@@ -4996,7 +5187,16 @@
                 <w:sz w:val="20"/>
                 <w:szCs w:val="20"/>
               </w:rPr>
-              <w:t xml:space="preserve"> se ajusta </w:t>
+              <w:t xml:space="preserve"> se </w:t>
+            </w:r>
+            <w:r>
+              <w:rPr>
+                <w:rFonts w:asciiTheme="minorHAnsi" w:hAnsiTheme="minorHAnsi"/>
+                <w:sz w:val="20"/>
+                <w:szCs w:val="20"/>
+              </w:rPr>
+              <w:lastRenderedPageBreak/>
+              <w:t xml:space="preserve">ajusta </w:t>
             </w:r>
             <w:r>
               <w:rPr>
@@ -5032,6 +5232,7 @@
               <w:rPr>
                 <w:noProof/>
               </w:rPr>
+              <w:lastRenderedPageBreak/>
               <w:drawing>
                 <wp:inline distT="0" distB="0" distL="0" distR="0" wp14:anchorId="7B515198" wp14:editId="6CD641F3">
                   <wp:extent cx="1051082" cy="1508760"/>
@@ -5092,8 +5293,8 @@
       <w:pPr>
         <w:pStyle w:val="Ttulo1"/>
       </w:pPr>
-      <w:r>
-        <w:lastRenderedPageBreak/>
+      <w:bookmarkStart w:id="5" w:name="_Toc228505773"/>
+      <w:r>
         <w:t xml:space="preserve">Describa el algoritmo de </w:t>
       </w:r>
       <w:r>
@@ -5103,16 +5304,9 @@
         <w:t>Sistema en L</w:t>
       </w:r>
       <w:r>
-        <w:t xml:space="preserve"> que va a utilizar, incluyendo los procesos de Modelado y </w:t>
-      </w:r>
-      <w:proofErr w:type="spellStart"/>
-      <w:r>
-        <w:t>Rigging</w:t>
-      </w:r>
-      <w:proofErr w:type="spellEnd"/>
-      <w:r>
-        <w:t xml:space="preserve"> procedural en maya.</w:t>
-      </w:r>
+        <w:t xml:space="preserve"> que va a utilizar, incluyendo los procesos de Modelado y Rigging procedural en maya.</w:t>
+      </w:r>
+      <w:bookmarkEnd w:id="5"/>
     </w:p>
     <w:p>
       <w:pPr>
@@ -5125,7 +5319,7 @@
           <w:lang w:val="es-MX"/>
         </w:rPr>
       </w:pPr>
-      <w:commentRangeStart w:id="5"/>
+      <w:commentRangeStart w:id="6"/>
     </w:p>
     <w:p>
       <w:pPr>
@@ -5503,12 +5697,12 @@
         </w:rPr>
         <w:t>.</w:t>
       </w:r>
-      <w:commentRangeEnd w:id="5"/>
+      <w:commentRangeEnd w:id="6"/>
       <w:r>
         <w:rPr>
           <w:rStyle w:val="Refdecomentario"/>
         </w:rPr>
-        <w:commentReference w:id="5"/>
+        <w:commentReference w:id="6"/>
       </w:r>
     </w:p>
     <w:p>
@@ -5589,6 +5783,7 @@
           <w:lang w:eastAsia="es-CO"/>
         </w:rPr>
       </w:pPr>
+      <w:bookmarkStart w:id="7" w:name="_Toc228505774"/>
       <w:r>
         <w:rPr>
           <w:rFonts w:eastAsia="Times New Roman"/>
@@ -5596,7 +5791,6 @@
           <w:bCs/>
           <w:lang w:eastAsia="es-CO"/>
         </w:rPr>
-        <w:lastRenderedPageBreak/>
         <w:t>Vocabulario</w:t>
       </w:r>
       <w:r>
@@ -5617,6 +5811,7 @@
         </w:rPr>
         <w:t>(Símbolos y elementos del sistema)</w:t>
       </w:r>
+      <w:bookmarkEnd w:id="7"/>
     </w:p>
     <w:p>
       <w:pPr>
@@ -6770,6 +6965,7 @@
           </w:tcPr>
           <w:p>
             <w:r>
+              <w:lastRenderedPageBreak/>
               <w:t>II</w:t>
             </w:r>
           </w:p>
@@ -6795,11 +6991,7 @@
           </w:tcPr>
           <w:p>
             <w:r>
-              <w:t xml:space="preserve">El axioma define una estructura base que posteriormente será expandida mediante reglas hasta </w:t>
-            </w:r>
-            <w:r>
-              <w:lastRenderedPageBreak/>
-              <w:t>conformar un conejo completo compuesto por 13 primitivas.</w:t>
+              <w:t>El axioma define una estructura base que posteriormente será expandida mediante reglas hasta conformar un conejo completo compuesto por 13 primitivas.</w:t>
             </w:r>
           </w:p>
           <w:p/>
@@ -6901,7 +7093,6 @@
                 <w:szCs w:val="24"/>
                 <w:lang w:eastAsia="es-CO"/>
               </w:rPr>
-              <w:lastRenderedPageBreak/>
               <w:drawing>
                 <wp:inline distT="0" distB="0" distL="0" distR="0" wp14:anchorId="7FF8EB9B" wp14:editId="2979F82A">
                   <wp:extent cx="381267" cy="1303020"/>
@@ -6959,7 +7150,6 @@
           </w:tcPr>
           <w:p>
             <w:r>
-              <w:lastRenderedPageBreak/>
               <w:t>III</w:t>
             </w:r>
           </w:p>
@@ -7619,7 +7809,6 @@
                 <w:b/>
                 <w:bCs/>
               </w:rPr>
-              <w:lastRenderedPageBreak/>
               <w:t>Gordo y pequeñito</w:t>
             </w:r>
             <w:r>
@@ -7672,7 +7861,6 @@
                 <w:szCs w:val="24"/>
                 <w:lang w:eastAsia="es-CO"/>
               </w:rPr>
-              <w:lastRenderedPageBreak/>
               <w:drawing>
                 <wp:inline distT="0" distB="0" distL="0" distR="0" wp14:anchorId="2D4256FC" wp14:editId="4A21A7A2">
                   <wp:extent cx="909797" cy="4015740"/>
@@ -8094,6 +8282,7 @@
               </w:numPr>
             </w:pPr>
             <w:r>
+              <w:lastRenderedPageBreak/>
               <w:t>Cabeza: 25%</w:t>
             </w:r>
           </w:p>
@@ -8172,6 +8361,7 @@
                 <w:szCs w:val="24"/>
                 <w:lang w:eastAsia="es-CO"/>
               </w:rPr>
+              <w:lastRenderedPageBreak/>
               <w:drawing>
                 <wp:inline distT="0" distB="0" distL="0" distR="0" wp14:anchorId="4DA1F6CC" wp14:editId="50E7B097">
                   <wp:extent cx="1657087" cy="1080000"/>
@@ -8532,7 +8722,6 @@
           </w:tcPr>
           <w:p>
             <w:r>
-              <w:lastRenderedPageBreak/>
               <w:t>IV</w:t>
             </w:r>
           </w:p>
@@ -8909,7 +9098,6 @@
               <w:rPr>
                 <w:noProof/>
               </w:rPr>
-              <w:lastRenderedPageBreak/>
               <w:t>a</w:t>
             </w:r>
             <w:r>
@@ -9076,7 +9264,6 @@
                 <w:szCs w:val="24"/>
                 <w:lang w:eastAsia="es-CO"/>
               </w:rPr>
-              <w:lastRenderedPageBreak/>
               <w:drawing>
                 <wp:inline distT="0" distB="0" distL="0" distR="0" wp14:anchorId="6584350C" wp14:editId="44CA532C">
                   <wp:extent cx="1048789" cy="3622964"/>
@@ -9145,7 +9332,6 @@
                 <w:szCs w:val="24"/>
                 <w:lang w:eastAsia="es-CO"/>
               </w:rPr>
-              <w:lastRenderedPageBreak/>
               <w:drawing>
                 <wp:inline distT="0" distB="0" distL="0" distR="0" wp14:anchorId="16BE29BE" wp14:editId="0B9DB635">
                   <wp:extent cx="1609050" cy="2438400"/>
@@ -9202,7 +9388,6 @@
           </w:tcPr>
           <w:p>
             <w:r>
-              <w:lastRenderedPageBreak/>
               <w:t>V</w:t>
             </w:r>
           </w:p>
@@ -9384,7 +9569,15 @@
           <w:sz w:val="24"/>
           <w:szCs w:val="24"/>
         </w:rPr>
-        <w:t>Una vez generado el modelo tridimensional del conejo, el sistema contempla la implementación de un sistema de rigging procedural que permite dotar al personaje de estructuras de control para su posible animación.</w:t>
+        <w:t xml:space="preserve">Una vez generado el modelo tridimensional del conejo, el sistema contempla la implementación de un sistema de rigging procedural que permite dotar al personaje de estructuras de control para su posible </w:t>
+      </w:r>
+      <w:r>
+        <w:rPr>
+          <w:sz w:val="24"/>
+          <w:szCs w:val="24"/>
+        </w:rPr>
+        <w:lastRenderedPageBreak/>
+        <w:t>animación.</w:t>
       </w:r>
       <w:r>
         <w:rPr>
@@ -9769,7 +9962,6 @@
           <w:sz w:val="24"/>
           <w:szCs w:val="24"/>
         </w:rPr>
-        <w:lastRenderedPageBreak/>
         <w:t>Elementos dinámicos (orejas o cola)</w:t>
       </w:r>
       <w:r>
@@ -10173,6 +10365,7 @@
           <w:sz w:val="24"/>
           <w:szCs w:val="24"/>
         </w:rPr>
+        <w:lastRenderedPageBreak/>
         <w:t>La tercera sección estará orientada a la selección de una emoción base, la cual determinará la intención expresiva del personaje</w:t>
       </w:r>
       <w:r>
@@ -10382,7 +10575,6 @@
           <w:sz w:val="24"/>
           <w:szCs w:val="24"/>
         </w:rPr>
-        <w:lastRenderedPageBreak/>
         <w:t>A nivel técnico, estas variaciones se implementarán mediante el uso de materiales en Autodesk Maya que integran:</w:t>
       </w:r>
     </w:p>
@@ -10646,6 +10838,7 @@
           <w:sz w:val="24"/>
           <w:szCs w:val="24"/>
         </w:rPr>
+        <w:lastRenderedPageBreak/>
         <w:drawing>
           <wp:inline distT="0" distB="0" distL="0" distR="0" wp14:anchorId="11CB7ECD" wp14:editId="33D24E24">
             <wp:extent cx="2600659" cy="3634740"/>
@@ -10726,7 +10919,6 @@
           <w:sz w:val="24"/>
           <w:szCs w:val="24"/>
         </w:rPr>
-        <w:lastRenderedPageBreak/>
         <w:drawing>
           <wp:inline distT="0" distB="0" distL="0" distR="0" wp14:anchorId="3BEBB0E8" wp14:editId="4BEFCDA2">
             <wp:extent cx="5400040" cy="4168775"/>
@@ -10778,7 +10970,7 @@
 
 <file path=word/comments.xml><?xml version="1.0" encoding="utf-8"?>
 <w:comments xmlns:wpc="http://schemas.microsoft.com/office/word/2010/wordprocessingCanvas" xmlns:cx="http://schemas.microsoft.com/office/drawing/2014/chartex" xmlns:cx1="http://schemas.microsoft.com/office/drawing/2015/9/8/chartex" xmlns:cx2="http://schemas.microsoft.com/office/drawing/2015/10/21/chartex" xmlns:cx3="http://schemas.microsoft.com/office/drawing/2016/5/9/chartex" xmlns:cx4="http://schemas.microsoft.com/office/drawing/2016/5/10/chartex" xmlns:cx5="http://schemas.microsoft.com/office/drawing/2016/5/11/chartex" xmlns:cx6="http://schemas.microsoft.com/office/drawing/2016/5/12/chartex" xmlns:cx7="http://schemas.microsoft.com/office/drawing/2016/5/13/chartex" xmlns:cx8="http://schemas.microsoft.com/office/drawing/2016/5/14/chartex" xmlns:mc="http://schemas.openxmlformats.org/markup-compatibility/2006" xmlns:aink="http://schemas.microsoft.com/office/drawing/2016/ink" xmlns:am3d="http://schemas.microsoft.com/office/drawing/2017/model3d" xmlns:o="urn:schemas-microsoft-com:office:office" xmlns:r="http://schemas.openxmlformats.org/officeDocument/2006/relationships" xmlns:m="http://schemas.openxmlformats.org/officeDocument/2006/math" xmlns:v="urn:schemas-microsoft-com:vml" xmlns:wp14="http://schemas.microsoft.com/office/word/2010/wordprocessingDrawing" xmlns:wp="http://schemas.openxmlformats.org/drawingml/2006/wordprocessingDrawing" xmlns:w10="urn:schemas-microsoft-com:office:word" xmlns:w="http://schemas.openxmlformats.org/wordprocessingml/2006/main" xmlns:w14="http://schemas.microsoft.com/office/word/2010/wordml" xmlns:w15="http://schemas.microsoft.com/office/word/2012/wordml" xmlns:w16cex="http://schemas.microsoft.com/office/word/2018/wordml/cex" xmlns:w16cid="http://schemas.microsoft.com/office/word/2016/wordml/cid" xmlns:w16="http://schemas.microsoft.com/office/word/2018/wordml" xmlns:w16sdtdh="http://schemas.microsoft.com/office/word/2020/wordml/sdtdatahash" xmlns:w16se="http://schemas.microsoft.com/office/word/2015/wordml/symex" xmlns:wpg="http://schemas.microsoft.com/office/word/2010/wordprocessingGroup" xmlns:wpi="http://schemas.microsoft.com/office/word/2010/wordprocessingInk" xmlns:wne="http://schemas.microsoft.com/office/word/2006/wordml" xmlns:wps="http://schemas.microsoft.com/office/word/2010/wordprocessingShape" mc:Ignorable="w14 w15 w16se w16cid w16 w16cex w16sdtdh wp14">
-  <w:comment w:id="5" w:author="Diana Mayerly Camargo Pedraza" w:date="2026-05-01T05:17:00Z" w:initials="DMCP">
+  <w:comment w:id="6" w:author="Diana Mayerly Camargo Pedraza" w:date="2026-05-01T05:17:00Z" w:initials="DMCP">
     <w:p>
       <w:pPr>
         <w:pStyle w:val="Textocomentario"/>

</xml_diff>

<commit_message>
axioma en Documento tecnico
</commit_message>
<xml_diff>
--- a/InstruccionesChatGpt_Word/InstruccionesChatGpt_Word_009.docx
+++ b/InstruccionesChatGpt_Word/InstruccionesChatGpt_Word_009.docx
@@ -823,9 +823,6 @@
     <w:sdt>
       <w:sdtPr>
         <w:rPr>
-          <w:b w:val="0"/>
-          <w:bCs w:val="0"/>
-          <w:caps w:val="0"/>
           <w:color w:val="auto"/>
           <w:spacing w:val="0"/>
           <w:sz w:val="20"/>
@@ -840,6 +837,9 @@
       </w:sdtPr>
       <w:sdtEndPr>
         <w:rPr>
+          <w:b w:val="0"/>
+          <w:bCs w:val="0"/>
+          <w:caps w:val="0"/>
           <w:lang w:val="es-ES"/>
         </w:rPr>
       </w:sdtEndPr>
@@ -1839,71 +1839,18 @@
     </w:p>
     <w:p>
       <w:pPr>
-        <w:pStyle w:val="Prrafodelista"/>
-        <w:rPr>
-          <w:b/>
-          <w:bCs/>
-          <w:sz w:val="24"/>
-          <w:szCs w:val="24"/>
-          <w:lang w:val="es-MX"/>
-        </w:rPr>
-      </w:pPr>
-    </w:p>
-    <w:p>
-      <w:pPr>
-        <w:pStyle w:val="Prrafodelista"/>
-        <w:rPr>
-          <w:b/>
-          <w:bCs/>
-          <w:sz w:val="24"/>
-          <w:szCs w:val="24"/>
-          <w:lang w:val="es-MX"/>
-        </w:rPr>
-      </w:pPr>
-    </w:p>
-    <w:p>
-      <w:pPr>
-        <w:pStyle w:val="Prrafodelista"/>
-        <w:rPr>
-          <w:b/>
-          <w:bCs/>
-          <w:sz w:val="24"/>
-          <w:szCs w:val="24"/>
-          <w:lang w:val="es-MX"/>
-        </w:rPr>
-      </w:pPr>
-    </w:p>
-    <w:p>
-      <w:pPr>
-        <w:pStyle w:val="Prrafodelista"/>
-        <w:rPr>
-          <w:b/>
-          <w:bCs/>
-          <w:sz w:val="24"/>
-          <w:szCs w:val="24"/>
-          <w:lang w:val="es-MX"/>
-        </w:rPr>
-      </w:pPr>
-    </w:p>
-    <w:p>
-      <w:pPr>
-        <w:pStyle w:val="Prrafodelista"/>
-        <w:rPr>
-          <w:b/>
-          <w:bCs/>
-          <w:sz w:val="24"/>
-          <w:szCs w:val="24"/>
-          <w:lang w:val="es-MX"/>
-        </w:rPr>
-      </w:pPr>
-    </w:p>
-    <w:p>
-      <w:pPr>
         <w:pStyle w:val="Ttulo1"/>
       </w:pPr>
       <w:bookmarkStart w:id="1" w:name="_Toc228505769"/>
       <w:r>
-        <w:t>Nombre de los artistas técnicos</w:t>
+        <w:lastRenderedPageBreak/>
+        <w:t xml:space="preserve">Nombre de los </w:t>
+      </w:r>
+      <w:r>
+        <w:t>artistas</w:t>
+      </w:r>
+      <w:r>
+        <w:t xml:space="preserve"> técnicos</w:t>
       </w:r>
       <w:bookmarkEnd w:id="1"/>
       <w:r>
@@ -2696,7 +2643,6 @@
               <w:ind w:left="0"/>
             </w:pPr>
             <w:r>
-              <w:lastRenderedPageBreak/>
               <w:t>Tristeza</w:t>
             </w:r>
           </w:p>
@@ -2812,10 +2758,33 @@
     </w:p>
     <w:p>
       <w:pPr>
+        <w:jc w:val="center"/>
+        <w:rPr>
+          <w:b/>
+          <w:bCs/>
+          <w:sz w:val="24"/>
+          <w:szCs w:val="24"/>
+        </w:rPr>
+      </w:pPr>
+    </w:p>
+    <w:p>
+      <w:pPr>
+        <w:jc w:val="center"/>
+        <w:rPr>
+          <w:b/>
+          <w:bCs/>
+          <w:sz w:val="24"/>
+          <w:szCs w:val="24"/>
+        </w:rPr>
+      </w:pPr>
+    </w:p>
+    <w:p>
+      <w:pPr>
         <w:pStyle w:val="Ttulo1"/>
       </w:pPr>
       <w:bookmarkStart w:id="4" w:name="_Toc228505772"/>
       <w:r>
+        <w:lastRenderedPageBreak/>
         <w:t xml:space="preserve">¿Cuáles referentes artísticos y técnicos tienen su herramienta?, </w:t>
       </w:r>
       <w:r>
@@ -3996,6 +3965,7 @@
                 <w:color w:val="000000"/>
                 <w:lang w:eastAsia="es-CO"/>
               </w:rPr>
+              <w:lastRenderedPageBreak/>
               <w:t>Referentes Técnicos</w:t>
             </w:r>
           </w:p>
@@ -5187,16 +5157,7 @@
                 <w:sz w:val="20"/>
                 <w:szCs w:val="20"/>
               </w:rPr>
-              <w:t xml:space="preserve"> se </w:t>
-            </w:r>
-            <w:r>
-              <w:rPr>
-                <w:rFonts w:asciiTheme="minorHAnsi" w:hAnsiTheme="minorHAnsi"/>
-                <w:sz w:val="20"/>
-                <w:szCs w:val="20"/>
-              </w:rPr>
-              <w:lastRenderedPageBreak/>
-              <w:t xml:space="preserve">ajusta </w:t>
+              <w:t xml:space="preserve"> se ajusta </w:t>
             </w:r>
             <w:r>
               <w:rPr>
@@ -5232,7 +5193,6 @@
               <w:rPr>
                 <w:noProof/>
               </w:rPr>
-              <w:lastRenderedPageBreak/>
               <w:drawing>
                 <wp:inline distT="0" distB="0" distL="0" distR="0" wp14:anchorId="7B515198" wp14:editId="6CD641F3">
                   <wp:extent cx="1051082" cy="1508760"/>
@@ -5295,6 +5255,7 @@
       </w:pPr>
       <w:bookmarkStart w:id="5" w:name="_Toc228505773"/>
       <w:r>
+        <w:lastRenderedPageBreak/>
         <w:t xml:space="preserve">Describa el algoritmo de </w:t>
       </w:r>
       <w:r>
@@ -5763,52 +5724,16 @@
     <w:p>
       <w:pPr>
         <w:pStyle w:val="Ttulo2"/>
-        <w:numPr>
-          <w:ilvl w:val="1"/>
-          <w:numId w:val="23"/>
-        </w:numPr>
-        <w:pBdr>
-          <w:top w:val="single" w:sz="4" w:space="1" w:color="E1FFFD"/>
-          <w:left w:val="single" w:sz="4" w:space="4" w:color="E1FFFD"/>
-          <w:bottom w:val="single" w:sz="4" w:space="1" w:color="E1FFFD"/>
-          <w:right w:val="single" w:sz="4" w:space="4" w:color="E1FFFD"/>
-          <w:between w:val="single" w:sz="4" w:space="1" w:color="E1FFFD"/>
-          <w:bar w:val="single" w:sz="4" w:color="E1FFFD"/>
-        </w:pBdr>
-        <w:shd w:val="clear" w:color="auto" w:fill="E1FFFD"/>
-        <w:rPr>
-          <w:rFonts w:eastAsia="Times New Roman"/>
-          <w:b/>
-          <w:bCs/>
-          <w:lang w:eastAsia="es-CO"/>
-        </w:rPr>
       </w:pPr>
       <w:bookmarkStart w:id="7" w:name="_Toc228505774"/>
       <w:r>
-        <w:rPr>
-          <w:rFonts w:eastAsia="Times New Roman"/>
-          <w:b/>
-          <w:bCs/>
-          <w:lang w:eastAsia="es-CO"/>
-        </w:rPr>
+        <w:lastRenderedPageBreak/>
         <w:t>Vocabulario</w:t>
       </w:r>
       <w:r>
-        <w:rPr>
-          <w:rFonts w:eastAsia="Times New Roman"/>
-          <w:b/>
-          <w:bCs/>
-          <w:lang w:eastAsia="es-CO"/>
-        </w:rPr>
         <w:t xml:space="preserve"> </w:t>
       </w:r>
       <w:r>
-        <w:rPr>
-          <w:rFonts w:eastAsia="Times New Roman"/>
-          <w:b/>
-          <w:bCs/>
-          <w:lang w:eastAsia="es-CO"/>
-        </w:rPr>
         <w:t>(Símbolos y elementos del sistema)</w:t>
       </w:r>
       <w:bookmarkEnd w:id="7"/>
@@ -5820,6 +5745,98 @@
           <w:lang w:eastAsia="es-CO"/>
         </w:rPr>
       </w:pPr>
+    </w:p>
+    <w:p>
+      <w:pPr>
+        <w:spacing w:after="0"/>
+        <w:rPr>
+          <w:lang w:eastAsia="es-CO"/>
+        </w:rPr>
+      </w:pPr>
+    </w:p>
+    <w:p>
+      <w:pPr>
+        <w:spacing w:after="0"/>
+        <w:ind w:left="993"/>
+        <w:rPr>
+          <w:lang w:eastAsia="es-CO"/>
+        </w:rPr>
+      </w:pPr>
+      <w:r>
+        <w:rPr>
+          <w:noProof/>
+          <w:lang w:eastAsia="es-CO"/>
+        </w:rPr>
+        <mc:AlternateContent>
+          <mc:Choice Requires="wpc">
+            <w:drawing>
+              <wp:inline distT="0" distB="0" distL="0" distR="0" wp14:anchorId="6861D63E" wp14:editId="7E01F4F8">
+                <wp:extent cx="5239910" cy="3150235"/>
+                <wp:effectExtent l="0" t="0" r="0" b="0"/>
+                <wp:docPr id="8" name="Lienzo 8"/>
+                <wp:cNvGraphicFramePr>
+                  <a:graphicFrameLocks xmlns:a="http://schemas.openxmlformats.org/drawingml/2006/main" noChangeAspect="1"/>
+                </wp:cNvGraphicFramePr>
+                <a:graphic xmlns:a="http://schemas.openxmlformats.org/drawingml/2006/main">
+                  <a:graphicData uri="http://schemas.microsoft.com/office/word/2010/wordprocessingCanvas">
+                    <wpc:wpc>
+                      <wpc:bg>
+                        <a:solidFill>
+                          <a:prstClr val="white"/>
+                        </a:solidFill>
+                      </wpc:bg>
+                      <wpc:whole/>
+                      <w14:contentPart bwMode="auto" r:id="rId29">
+                        <w14:nvContentPartPr>
+                          <w14:cNvPr id="12" name="Entrada de lápiz 12"/>
+                          <w14:cNvContentPartPr/>
+                        </w14:nvContentPartPr>
+                        <w14:xfrm>
+                          <a:off x="7920" y="1550379"/>
+                          <a:ext cx="360" cy="360"/>
+                        </w14:xfrm>
+                      </w14:contentPart>
+                    </wpc:wpc>
+                  </a:graphicData>
+                </a:graphic>
+              </wp:inline>
+            </w:drawing>
+          </mc:Choice>
+          <mc:Fallback>
+            <w:pict>
+              <v:group w14:anchorId="1AFFF16B" id="Lienzo 8" o:spid="_x0000_s1026" editas="canvas" style="width:412.6pt;height:248.05pt;mso-position-horizontal-relative:char;mso-position-vertical-relative:line" coordsize="52393,31502" o:gfxdata="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">
+                <v:shapetype id="_x0000_t75" coordsize="21600,21600" o:spt="75" o:preferrelative="t" path="m@4@5l@4@11@9@11@9@5xe" filled="f" stroked="f">
+                  <v:stroke joinstyle="miter"/>
+                  <v:formulas>
+                    <v:f eqn="if lineDrawn pixelLineWidth 0"/>
+                    <v:f eqn="sum @0 1 0"/>
+                    <v:f eqn="sum 0 0 @1"/>
+                    <v:f eqn="prod @2 1 2"/>
+                    <v:f eqn="prod @3 21600 pixelWidth"/>
+                    <v:f eqn="prod @3 21600 pixelHeight"/>
+                    <v:f eqn="sum @0 0 1"/>
+                    <v:f eqn="prod @6 1 2"/>
+                    <v:f eqn="prod @7 21600 pixelWidth"/>
+                    <v:f eqn="sum @8 21600 0"/>
+                    <v:f eqn="prod @7 21600 pixelHeight"/>
+                    <v:f eqn="sum @10 21600 0"/>
+                  </v:formulas>
+                  <v:path o:extrusionok="f" gradientshapeok="t" o:connecttype="rect"/>
+                  <o:lock v:ext="edit" aspectratio="t"/>
+                </v:shapetype>
+                <v:shape id="_x0000_s1027" type="#_x0000_t75" style="position:absolute;width:52393;height:31502;visibility:visible;mso-wrap-style:square" filled="t">
+                  <v:fill o:detectmouseclick="t"/>
+                  <v:path o:connecttype="none"/>
+                </v:shape>
+                <v:shape id="Entrada de lápiz 12" o:spid="_x0000_s1028" type="#_x0000_t75" style="position:absolute;left:-100;top:15327;width:359;height:360;visibility:visible;mso-wrap-style:square" o:gfxdata="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">
+                  <v:imagedata r:id="rId30" o:title=""/>
+                </v:shape>
+                <w10:anchorlock/>
+              </v:group>
+            </w:pict>
+          </mc:Fallback>
+        </mc:AlternateContent>
+      </w:r>
     </w:p>
     <w:tbl>
       <w:tblPr>
@@ -5886,7 +5903,37 @@
                 <w:u w:val="single"/>
                 <w:lang w:eastAsia="es-CO"/>
               </w:rPr>
-              <w:t>Elemento Parte inferior</w:t>
+              <w:t xml:space="preserve">Elemento </w:t>
+            </w:r>
+            <w:r>
+              <w:rPr>
+                <w:rFonts w:eastAsia="Times New Roman" w:cs="Times New Roman"/>
+                <w:sz w:val="24"/>
+                <w:szCs w:val="24"/>
+                <w:u w:val="single"/>
+                <w:lang w:eastAsia="es-CO"/>
+              </w:rPr>
+              <w:t>“</w:t>
+            </w:r>
+            <w:r>
+              <w:rPr>
+                <w:rFonts w:eastAsia="Times New Roman" w:cs="Times New Roman"/>
+                <w:sz w:val="24"/>
+                <w:szCs w:val="24"/>
+                <w:u w:val="single"/>
+                <w:lang w:eastAsia="es-CO"/>
+              </w:rPr>
+              <w:t>Parte inferior</w:t>
+            </w:r>
+            <w:r>
+              <w:rPr>
+                <w:rFonts w:eastAsia="Times New Roman" w:cs="Times New Roman"/>
+                <w:sz w:val="24"/>
+                <w:szCs w:val="24"/>
+                <w:u w:val="single"/>
+                <w:lang w:eastAsia="es-CO"/>
+              </w:rPr>
+              <w:t>”</w:t>
             </w:r>
           </w:p>
         </w:tc>
@@ -5906,7 +5953,6 @@
                 <w:lang w:eastAsia="es-CO"/>
               </w:rPr>
             </w:pPr>
-            <w:proofErr w:type="gramStart"/>
             <w:r>
               <w:rPr>
                 <w:rFonts w:eastAsia="Times New Roman" w:cs="Times New Roman"/>
@@ -5915,9 +5961,8 @@
                 <w:u w:val="single"/>
                 <w:lang w:eastAsia="es-CO"/>
               </w:rPr>
-              <w:t>Elemento ”Conejo</w:t>
-            </w:r>
-            <w:proofErr w:type="gramEnd"/>
+              <w:t>Elemento” Conejo</w:t>
+            </w:r>
             <w:r>
               <w:rPr>
                 <w:rFonts w:eastAsia="Times New Roman" w:cs="Times New Roman"/>
@@ -5973,7 +6018,7 @@
                           </pic:cNvPicPr>
                         </pic:nvPicPr>
                         <pic:blipFill>
-                          <a:blip r:embed="rId29" cstate="print">
+                          <a:blip r:embed="rId31" cstate="print">
                             <a:extLst>
                               <a:ext uri="{28A0092B-C50C-407E-A947-70E740481C1C}">
                                 <a14:useLocalDpi xmlns:a14="http://schemas.microsoft.com/office/drawing/2010/main" val="0"/>
@@ -6044,7 +6089,7 @@
                           </pic:cNvPicPr>
                         </pic:nvPicPr>
                         <pic:blipFill>
-                          <a:blip r:embed="rId30" cstate="print">
+                          <a:blip r:embed="rId32" cstate="print">
                             <a:extLst>
                               <a:ext uri="{28A0092B-C50C-407E-A947-70E740481C1C}">
                                 <a14:useLocalDpi xmlns:a14="http://schemas.microsoft.com/office/drawing/2010/main" val="0"/>
@@ -6112,7 +6157,7 @@
                           </pic:cNvPicPr>
                         </pic:nvPicPr>
                         <pic:blipFill>
-                          <a:blip r:embed="rId31" cstate="print">
+                          <a:blip r:embed="rId33" cstate="print">
                             <a:extLst>
                               <a:ext uri="{28A0092B-C50C-407E-A947-70E740481C1C}">
                                 <a14:useLocalDpi xmlns:a14="http://schemas.microsoft.com/office/drawing/2010/main" val="0"/>
@@ -6927,7 +6972,7 @@
                           </pic:cNvPicPr>
                         </pic:nvPicPr>
                         <pic:blipFill>
-                          <a:blip r:embed="rId32" cstate="print">
+                          <a:blip r:embed="rId34" cstate="print">
                             <a:extLst>
                               <a:ext uri="{28A0092B-C50C-407E-A947-70E740481C1C}">
                                 <a14:useLocalDpi xmlns:a14="http://schemas.microsoft.com/office/drawing/2010/main" val="0"/>
@@ -6965,7 +7010,6 @@
           </w:tcPr>
           <w:p>
             <w:r>
-              <w:lastRenderedPageBreak/>
               <w:t>II</w:t>
             </w:r>
           </w:p>
@@ -7111,7 +7155,7 @@
                           </pic:cNvPicPr>
                         </pic:nvPicPr>
                         <pic:blipFill>
-                          <a:blip r:embed="rId33" cstate="print">
+                          <a:blip r:embed="rId35" cstate="print">
                             <a:extLst>
                               <a:ext uri="{28A0092B-C50C-407E-A947-70E740481C1C}">
                                 <a14:useLocalDpi xmlns:a14="http://schemas.microsoft.com/office/drawing/2010/main" val="0"/>
@@ -7355,7 +7399,7 @@
                           </pic:cNvPicPr>
                         </pic:nvPicPr>
                         <pic:blipFill>
-                          <a:blip r:embed="rId34" cstate="print">
+                          <a:blip r:embed="rId36" cstate="print">
                             <a:extLst>
                               <a:ext uri="{28A0092B-C50C-407E-A947-70E740481C1C}">
                                 <a14:useLocalDpi xmlns:a14="http://schemas.microsoft.com/office/drawing/2010/main" val="0"/>
@@ -7633,7 +7677,7 @@
                           </pic:cNvPicPr>
                         </pic:nvPicPr>
                         <pic:blipFill>
-                          <a:blip r:embed="rId35" cstate="print">
+                          <a:blip r:embed="rId37" cstate="print">
                             <a:extLst>
                               <a:ext uri="{28A0092B-C50C-407E-A947-70E740481C1C}">
                                 <a14:useLocalDpi xmlns:a14="http://schemas.microsoft.com/office/drawing/2010/main" val="0"/>
@@ -7879,7 +7923,7 @@
                           </pic:cNvPicPr>
                         </pic:nvPicPr>
                         <pic:blipFill>
-                          <a:blip r:embed="rId36" cstate="print">
+                          <a:blip r:embed="rId38" cstate="print">
                             <a:extLst>
                               <a:ext uri="{28A0092B-C50C-407E-A947-70E740481C1C}">
                                 <a14:useLocalDpi xmlns:a14="http://schemas.microsoft.com/office/drawing/2010/main" val="0"/>
@@ -8073,7 +8117,7 @@
                           </pic:cNvPicPr>
                         </pic:nvPicPr>
                         <pic:blipFill>
-                          <a:blip r:embed="rId37" cstate="print">
+                          <a:blip r:embed="rId39" cstate="print">
                             <a:extLst>
                               <a:ext uri="{28A0092B-C50C-407E-A947-70E740481C1C}">
                                 <a14:useLocalDpi xmlns:a14="http://schemas.microsoft.com/office/drawing/2010/main" val="0"/>
@@ -8154,7 +8198,7 @@
                           </pic:cNvPicPr>
                         </pic:nvPicPr>
                         <pic:blipFill>
-                          <a:blip r:embed="rId38" cstate="print">
+                          <a:blip r:embed="rId40" cstate="print">
                             <a:extLst>
                               <a:ext uri="{28A0092B-C50C-407E-A947-70E740481C1C}">
                                 <a14:useLocalDpi xmlns:a14="http://schemas.microsoft.com/office/drawing/2010/main" val="0"/>
@@ -8380,7 +8424,7 @@
                           </pic:cNvPicPr>
                         </pic:nvPicPr>
                         <pic:blipFill>
-                          <a:blip r:embed="rId39" cstate="print">
+                          <a:blip r:embed="rId41" cstate="print">
                             <a:extLst>
                               <a:ext uri="{28A0092B-C50C-407E-A947-70E740481C1C}">
                                 <a14:useLocalDpi xmlns:a14="http://schemas.microsoft.com/office/drawing/2010/main" val="0"/>
@@ -8683,7 +8727,7 @@
                           </pic:cNvPicPr>
                         </pic:nvPicPr>
                         <pic:blipFill>
-                          <a:blip r:embed="rId40" cstate="print">
+                          <a:blip r:embed="rId42" cstate="print">
                             <a:extLst>
                               <a:ext uri="{28A0092B-C50C-407E-A947-70E740481C1C}">
                                 <a14:useLocalDpi xmlns:a14="http://schemas.microsoft.com/office/drawing/2010/main" val="0"/>
@@ -8838,7 +8882,7 @@
                           </pic:cNvPicPr>
                         </pic:nvPicPr>
                         <pic:blipFill>
-                          <a:blip r:embed="rId41" cstate="print">
+                          <a:blip r:embed="rId43" cstate="print">
                             <a:extLst>
                               <a:ext uri="{28A0092B-C50C-407E-A947-70E740481C1C}">
                                 <a14:useLocalDpi xmlns:a14="http://schemas.microsoft.com/office/drawing/2010/main" val="0"/>
@@ -9282,7 +9326,7 @@
                           </pic:cNvPicPr>
                         </pic:nvPicPr>
                         <pic:blipFill>
-                          <a:blip r:embed="rId42">
+                          <a:blip r:embed="rId44">
                             <a:extLst>
                               <a:ext uri="{28A0092B-C50C-407E-A947-70E740481C1C}">
                                 <a14:useLocalDpi xmlns:a14="http://schemas.microsoft.com/office/drawing/2010/main" val="0"/>
@@ -9350,7 +9394,7 @@
                           </pic:cNvPicPr>
                         </pic:nvPicPr>
                         <pic:blipFill>
-                          <a:blip r:embed="rId43" cstate="print">
+                          <a:blip r:embed="rId45" cstate="print">
                             <a:extLst>
                               <a:ext uri="{28A0092B-C50C-407E-A947-70E740481C1C}">
                                 <a14:useLocalDpi xmlns:a14="http://schemas.microsoft.com/office/drawing/2010/main" val="0"/>
@@ -10857,7 +10901,7 @@
                     </pic:cNvPicPr>
                   </pic:nvPicPr>
                   <pic:blipFill>
-                    <a:blip r:embed="rId44" cstate="print">
+                    <a:blip r:embed="rId46" cstate="print">
                       <a:extLst>
                         <a:ext uri="{28A0092B-C50C-407E-A947-70E740481C1C}">
                           <a14:useLocalDpi xmlns:a14="http://schemas.microsoft.com/office/drawing/2010/main" val="0"/>
@@ -10935,7 +10979,7 @@
                     <pic:cNvPicPr/>
                   </pic:nvPicPr>
                   <pic:blipFill>
-                    <a:blip r:embed="rId45"/>
+                    <a:blip r:embed="rId47"/>
                     <a:stretch>
                       <a:fillRect/>
                     </a:stretch>
@@ -12543,7 +12587,7 @@
   <w:abstractNum w:abstractNumId="12" w15:restartNumberingAfterBreak="0">
     <w:nsid w:val="4ECA6333"/>
     <w:multiLevelType w:val="multilevel"/>
-    <w:tmpl w:val="15887BCE"/>
+    <w:tmpl w:val="D570D724"/>
     <w:lvl w:ilvl="0">
       <w:start w:val="1"/>
       <w:numFmt w:val="decimal"/>
@@ -12560,6 +12604,7 @@
     <w:lvl w:ilvl="1">
       <w:start w:val="1"/>
       <w:numFmt w:val="decimal"/>
+      <w:pStyle w:val="Ttulo2"/>
       <w:isLgl/>
       <w:lvlText w:val="%1.%2."/>
       <w:lvlJc w:val="left"/>
@@ -14765,7 +14810,7 @@
     <w:link w:val="Ttulo1Car"/>
     <w:uiPriority w:val="9"/>
     <w:qFormat/>
-    <w:rsid w:val="003F70FE"/>
+    <w:rsid w:val="004862E2"/>
     <w:pPr>
       <w:numPr>
         <w:numId w:val="23"/>
@@ -14778,6 +14823,7 @@
       </w:pBdr>
       <w:shd w:val="clear" w:color="auto" w:fill="00C6BB" w:themeFill="accent1"/>
       <w:spacing w:after="0"/>
+      <w:ind w:left="0" w:hanging="567"/>
       <w:outlineLvl w:val="0"/>
     </w:pPr>
     <w:rPr>
@@ -14799,21 +14845,32 @@
     <w:uiPriority w:val="9"/>
     <w:unhideWhenUsed/>
     <w:qFormat/>
-    <w:rsid w:val="001E5578"/>
+    <w:rsid w:val="004862E2"/>
     <w:pPr>
+      <w:numPr>
+        <w:ilvl w:val="1"/>
+        <w:numId w:val="23"/>
+      </w:numPr>
       <w:pBdr>
-        <w:top w:val="single" w:sz="24" w:space="0" w:color="C0FFFB" w:themeColor="accent1" w:themeTint="33"/>
-        <w:left w:val="single" w:sz="24" w:space="0" w:color="C0FFFB" w:themeColor="accent1" w:themeTint="33"/>
-        <w:bottom w:val="single" w:sz="24" w:space="0" w:color="C0FFFB" w:themeColor="accent1" w:themeTint="33"/>
-        <w:right w:val="single" w:sz="24" w:space="0" w:color="C0FFFB" w:themeColor="accent1" w:themeTint="33"/>
+        <w:top w:val="single" w:sz="4" w:space="1" w:color="E1FFFD"/>
+        <w:left w:val="single" w:sz="4" w:space="4" w:color="E1FFFD"/>
+        <w:bottom w:val="single" w:sz="4" w:space="1" w:color="E1FFFD"/>
+        <w:right w:val="single" w:sz="4" w:space="4" w:color="E1FFFD"/>
+        <w:between w:val="single" w:sz="4" w:space="1" w:color="E1FFFD"/>
+        <w:bar w:val="single" w:sz="4" w:color="E1FFFD"/>
       </w:pBdr>
-      <w:shd w:val="clear" w:color="auto" w:fill="C0FFFB" w:themeFill="accent1" w:themeFillTint="33"/>
+      <w:shd w:val="clear" w:color="auto" w:fill="E1FFFD"/>
       <w:spacing w:after="0"/>
+      <w:ind w:left="0"/>
       <w:outlineLvl w:val="1"/>
     </w:pPr>
     <w:rPr>
+      <w:rFonts w:eastAsia="Times New Roman"/>
+      <w:b/>
+      <w:bCs/>
       <w:caps/>
       <w:spacing w:val="15"/>
+      <w:lang w:eastAsia="es-CO"/>
     </w:rPr>
   </w:style>
   <w:style w:type="paragraph" w:styleId="Ttulo3">
@@ -15067,7 +15124,7 @@
     <w:basedOn w:val="Fuentedeprrafopredeter"/>
     <w:link w:val="Ttulo1"/>
     <w:uiPriority w:val="9"/>
-    <w:rsid w:val="003F70FE"/>
+    <w:rsid w:val="004862E2"/>
     <w:rPr>
       <w:b/>
       <w:bCs/>
@@ -15136,11 +15193,15 @@
     <w:basedOn w:val="Fuentedeprrafopredeter"/>
     <w:link w:val="Ttulo2"/>
     <w:uiPriority w:val="9"/>
-    <w:rsid w:val="001E5578"/>
+    <w:rsid w:val="004862E2"/>
     <w:rPr>
+      <w:rFonts w:eastAsia="Times New Roman"/>
+      <w:b/>
+      <w:bCs/>
       <w:caps/>
       <w:spacing w:val="15"/>
-      <w:shd w:val="clear" w:color="auto" w:fill="C0FFFB" w:themeFill="accent1" w:themeFillTint="33"/>
+      <w:shd w:val="clear" w:color="auto" w:fill="E1FFFD"/>
+      <w:lang w:eastAsia="es-CO"/>
     </w:rPr>
   </w:style>
   <w:style w:type="character" w:customStyle="1" w:styleId="Ttulo4Car">
@@ -15594,6 +15655,32 @@
 </w:styles>
 </file>
 
+<file path=word/ink/ink1.xml><?xml version="1.0" encoding="utf-8"?>
+<inkml:ink xmlns:inkml="http://www.w3.org/2003/InkML">
+  <inkml:definitions>
+    <inkml:context xml:id="ctx0">
+      <inkml:inkSource xml:id="inkSrc0">
+        <inkml:traceFormat>
+          <inkml:channel name="X" type="integer" min="-2.14748E9" max="2.14748E9" units="cm"/>
+          <inkml:channel name="Y" type="integer" min="-2.14748E9" max="2.14748E9" units="cm"/>
+        </inkml:traceFormat>
+        <inkml:channelProperties>
+          <inkml:channelProperty channel="X" name="resolution" value="1000" units="1/cm"/>
+          <inkml:channelProperty channel="Y" name="resolution" value="1000" units="1/cm"/>
+        </inkml:channelProperties>
+      </inkml:inkSource>
+      <inkml:timestamp xml:id="ts0" timeString="2026-05-01T12:52:09.751"/>
+    </inkml:context>
+    <inkml:brush xml:id="br0">
+      <inkml:brushProperty name="width" value="0.1" units="cm"/>
+      <inkml:brushProperty name="height" value="0.1" units="cm"/>
+      <inkml:brushProperty name="ignorePressure" value="1"/>
+    </inkml:brush>
+  </inkml:definitions>
+  <inkml:trace contextRef="#ctx0" brushRef="#br0">0 1,'0'0</inkml:trace>
+</inkml:ink>
+</file>
+
 <file path=word/theme/theme1.xml><?xml version="1.0" encoding="utf-8"?>
 <a:theme xmlns:a="http://schemas.openxmlformats.org/drawingml/2006/main" name="Citable">
   <a:themeElements>

</xml_diff>